<commit_message>
Update artwork, reorder works
</commit_message>
<xml_diff>
--- a/content/artworks/a-gentle-touch/Description.docx
+++ b/content/artworks/a-gentle-touch/Description.docx
@@ -5,25 +5,32 @@
     <w:p>
       <w:pPr>
         <w:pStyle w:val="Title"/>
-        <w:spacing w:before="0" w:after="320"/>
+        <w:spacing w:after="320" w:before="0" w:lineRule="auto"/>
         <w:jc w:val="center"/>
         <w:rPr/>
       </w:pPr>
-      <w:bookmarkStart w:colFirst="0" w:colLast="0" w:name="_2w1i9ari6suu" w:id="0"/>
+      <w:bookmarkStart w:colFirst="0" w:colLast="0" w:name="_heading=h.orx0hwgg2zi1" w:id="0"/>
       <w:bookmarkEnd w:id="0"/>
       <w:r>
         <w:rPr>
-          <w:b/>
-          <w:color w:val="1D1B18"/>
+          <w:b w:val="1"/>
+          <w:bCs w:val="1"/>
+          <w:color w:val="1d1b18"/>
           <w:sz w:val="52"/>
+          <w:szCs w:val="52"/>
           <w:rtl w:val="0"/>
         </w:rPr>
         <w:t xml:space="preserve">A Gentle Touch</w:t>
       </w:r>
-    </w:p>
-    <w:p>
-      <w:pPr>
-        <w:spacing w:before="0" w:after="0" w:line="240" w:lineRule="auto"/>
+      <w:r>
+        <w:rPr>
+          <w:rtl w:val="0"/>
+        </w:rPr>
+      </w:r>
+    </w:p>
+    <w:p>
+      <w:pPr>
+        <w:spacing w:after="0" w:before="0" w:line="240" w:lineRule="auto"/>
         <w:rPr>
           <w:b w:val="1"/>
           <w:bCs w:val="1"/>
@@ -40,97 +47,140 @@
     <w:p>
       <w:pPr>
         <w:pStyle w:val="Heading2"/>
-        <w:spacing w:before="400" w:after="80"/>
-        <w:rPr/>
-      </w:pPr>
-      <w:bookmarkStart w:colFirst="0" w:colLast="0" w:name="_ovuduvfwqj1f" w:id="1"/>
+        <w:spacing w:after="80" w:before="400" w:lineRule="auto"/>
+        <w:rPr/>
+      </w:pPr>
+      <w:bookmarkStart w:colFirst="0" w:colLast="0" w:name="_heading=h.sp202k70hz91" w:id="1"/>
       <w:bookmarkEnd w:id="1"/>
       <w:r>
         <w:rPr>
-          <w:b/>
-          <w:color w:val="8A5A44"/>
+          <w:b w:val="1"/>
+          <w:bCs w:val="1"/>
+          <w:color w:val="8a5a44"/>
           <w:sz w:val="30"/>
+          <w:szCs w:val="30"/>
           <w:rtl w:val="0"/>
         </w:rPr>
         <w:t xml:space="preserve">Dimensions</w:t>
       </w:r>
-    </w:p>
-    <w:p>
-      <w:pPr>
-        <w:spacing w:before="0" w:after="120"/>
-        <w:rPr/>
-      </w:pPr>
-      <w:r>
-        <w:rPr>
-          <w:b/>
-          <w:color w:val="B3261E"/>
-          <w:sz w:val="24"/>
-          <w:rtl w:val="0"/>
-        </w:rPr>
-        <w:t xml:space="preserve">[todo]</w:t>
+      <w:r>
+        <w:rPr>
+          <w:rtl w:val="0"/>
+        </w:rPr>
+      </w:r>
+    </w:p>
+    <w:p>
+      <w:pPr>
+        <w:spacing w:after="120" w:before="0" w:lineRule="auto"/>
+        <w:rPr/>
+      </w:pPr>
+      <w:r>
+        <w:rPr>
+          <w:b w:val="1"/>
+          <w:bCs w:val="1"/>
+          <w:color w:val="b3261e"/>
+          <w:sz w:val="24"/>
+          <w:szCs w:val="24"/>
+          <w:rtl w:val="0"/>
+        </w:rPr>
+        <w:t xml:space="preserve">20” width × 26” height × 1.5” depth</w:t>
+      </w:r>
+      <w:r>
+        <w:rPr>
+          <w:rtl w:val="0"/>
+        </w:rPr>
       </w:r>
     </w:p>
     <w:p>
       <w:pPr>
         <w:pStyle w:val="Heading2"/>
-        <w:spacing w:before="400" w:after="80"/>
-        <w:rPr/>
-      </w:pPr>
-      <w:bookmarkStart w:colFirst="0" w:colLast="0" w:name="_k8hswhjxmlo0" w:id="2"/>
+        <w:spacing w:after="80" w:before="400" w:lineRule="auto"/>
+        <w:rPr/>
+      </w:pPr>
+      <w:bookmarkStart w:colFirst="0" w:colLast="0" w:name="_heading=h.e9h9468l768j" w:id="2"/>
       <w:bookmarkEnd w:id="2"/>
       <w:r>
         <w:rPr>
-          <w:b/>
-          <w:color w:val="8A5A44"/>
+          <w:b w:val="1"/>
+          <w:bCs w:val="1"/>
+          <w:color w:val="8a5a44"/>
           <w:sz w:val="30"/>
+          <w:szCs w:val="30"/>
           <w:rtl w:val="0"/>
         </w:rPr>
         <w:t xml:space="preserve">Material</w:t>
       </w:r>
-    </w:p>
-    <w:p>
-      <w:pPr>
-        <w:spacing w:before="0" w:after="120"/>
-        <w:rPr/>
-      </w:pPr>
-      <w:r>
-        <w:rPr>
-          <w:b/>
-          <w:color w:val="B3261E"/>
-          <w:sz w:val="24"/>
-          <w:rtl w:val="0"/>
-        </w:rPr>
-        <w:t xml:space="preserve">[todo]</w:t>
+      <w:r>
+        <w:rPr>
+          <w:rtl w:val="0"/>
+        </w:rPr>
+      </w:r>
+    </w:p>
+    <w:p>
+      <w:pPr>
+        <w:spacing w:after="120" w:before="0" w:lineRule="auto"/>
+        <w:rPr/>
+      </w:pPr>
+      <w:r>
+        <w:rPr>
+          <w:b w:val="1"/>
+          <w:bCs w:val="1"/>
+          <w:color w:val="b3261e"/>
+          <w:sz w:val="24"/>
+          <w:szCs w:val="24"/>
+          <w:rtl w:val="0"/>
+        </w:rPr>
+        <w:t xml:space="preserve">Ceramic Acrylic painting on wood</w:t>
+      </w:r>
+      <w:r>
+        <w:rPr>
+          <w:rtl w:val="0"/>
+        </w:rPr>
       </w:r>
     </w:p>
     <w:p>
       <w:pPr>
         <w:pStyle w:val="Heading2"/>
-        <w:spacing w:before="400" w:after="80"/>
-        <w:rPr/>
-      </w:pPr>
-      <w:bookmarkStart w:colFirst="0" w:colLast="0" w:name="_paty9uhqjzyo" w:id="3"/>
+        <w:spacing w:after="80" w:before="400" w:lineRule="auto"/>
+        <w:rPr/>
+      </w:pPr>
+      <w:bookmarkStart w:colFirst="0" w:colLast="0" w:name="_heading=h.hu869nh3p4vf" w:id="3"/>
       <w:bookmarkEnd w:id="3"/>
       <w:r>
         <w:rPr>
-          <w:b/>
-          <w:color w:val="8A5A44"/>
+          <w:b w:val="1"/>
+          <w:bCs w:val="1"/>
+          <w:color w:val="8a5a44"/>
           <w:sz w:val="30"/>
+          <w:szCs w:val="30"/>
           <w:rtl w:val="0"/>
         </w:rPr>
         <w:t xml:space="preserve">Short Description</w:t>
       </w:r>
-    </w:p>
-    <w:p>
-      <w:pPr>
-        <w:spacing w:before="0" w:after="160" w:line="276" w:lineRule="auto"/>
-        <w:rPr/>
-      </w:pPr>
-      <w:r>
+      <w:r>
+        <w:rPr>
+          <w:rtl w:val="0"/>
+        </w:rPr>
+      </w:r>
+    </w:p>
+    <w:p>
+      <w:pPr>
+        <w:spacing w:after="160" w:before="0" w:line="276" w:lineRule="auto"/>
         <w:rPr>
           <w:b w:val="0"/>
-          <w:color w:val="1D1B18"/>
-          <w:sz w:val="24"/>
+          <w:bCs w:val="0"/>
+          <w:color w:val="1d1b18"/>
+          <w:sz w:val="24"/>
+          <w:szCs w:val="24"/>
+        </w:rPr>
+      </w:pPr>
+      <w:r>
+        <w:rPr>
+          <w:b w:val="0"/>
+          <w:bCs w:val="0"/>
+          <w:color w:val="1d1b18"/>
+          <w:sz w:val="24"/>
+          <w:szCs w:val="24"/>
           <w:rtl w:val="0"/>
         </w:rPr>
         <w:t xml:space="preserve">A painting celebrating cultural beauty and is a reminder of the simplicity and tranquility</w:t>
@@ -138,40 +188,80 @@
     </w:p>
     <w:p>
       <w:pPr>
+        <w:spacing w:after="80" w:before="400" w:lineRule="auto"/>
+        <w:rPr/>
+      </w:pPr>
+      <w:r>
+        <w:rPr>
+          <w:b w:val="1"/>
+          <w:bCs w:val="1"/>
+          <w:color w:val="8a5a44"/>
+          <w:sz w:val="30"/>
+          <w:szCs w:val="30"/>
+          <w:rtl w:val="0"/>
+        </w:rPr>
+        <w:t xml:space="preserve">One liner</w:t>
+      </w:r>
+      <w:r>
+        <w:rPr>
+          <w:rtl w:val="0"/>
+        </w:rPr>
+      </w:r>
+    </w:p>
+    <w:p>
+      <w:pPr>
+        <w:spacing w:after="120" w:lineRule="auto"/>
+        <w:rPr>
+          <w:color w:val="1d1b18"/>
+          <w:sz w:val="24"/>
+          <w:szCs w:val="24"/>
+        </w:rPr>
+      </w:pPr>
+      <w:r>
+        <w:rPr>
+          <w:b w:val="1"/>
+          <w:bCs w:val="1"/>
+          <w:color w:val="b3261e"/>
+          <w:sz w:val="24"/>
+          <w:szCs w:val="24"/>
+          <w:rtl w:val="0"/>
+        </w:rPr>
+        <w:t xml:space="preserve">A gentle gaze and a timeless grace,</w:t>
+      </w:r>
+      <w:r>
+        <w:rPr>
+          <w:rtl w:val="0"/>
+        </w:rPr>
+      </w:r>
+    </w:p>
+    <w:p>
+      <w:pPr>
         <w:pStyle w:val="Heading2"/>
-        <w:spacing w:before="400" w:after="80"/>
-        <w:rPr/>
-      </w:pPr>
-      <w:bookmarkStart w:colFirst="0" w:colLast="0" w:name="_ggrrctkjo63l" w:id="4"/>
+        <w:spacing w:after="80" w:before="400" w:lineRule="auto"/>
+        <w:rPr/>
+      </w:pPr>
+      <w:bookmarkStart w:colFirst="0" w:colLast="0" w:name="_heading=h.lsqaonxx8ekt" w:id="4"/>
       <w:bookmarkEnd w:id="4"/>
       <w:r>
         <w:rPr>
-          <w:b/>
-          <w:color w:val="8A5A44"/>
+          <w:b w:val="1"/>
+          <w:bCs w:val="1"/>
+          <w:color w:val="8a5a44"/>
           <w:sz w:val="30"/>
+          <w:szCs w:val="30"/>
           <w:rtl w:val="0"/>
         </w:rPr>
         <w:t xml:space="preserve">Long Description</w:t>
       </w:r>
-    </w:p>
-    <w:p>
-      <w:pPr>
-        <w:spacing w:before="0" w:after="120"/>
-        <w:rPr/>
-      </w:pPr>
-      <w:r>
-        <w:rPr>
-          <w:b/>
-          <w:color w:val="B3261E"/>
-          <w:sz w:val="24"/>
-          <w:rtl w:val="0"/>
-        </w:rPr>
-        <w:t xml:space="preserve">[todo]</w:t>
-      </w:r>
-    </w:p>
-    <w:p>
-      <w:pPr>
-        <w:spacing w:before="0" w:after="0" w:line="240" w:lineRule="auto"/>
+      <w:r>
+        <w:rPr>
+          <w:rtl w:val="0"/>
+        </w:rPr>
+      </w:r>
+    </w:p>
+    <w:p>
+      <w:pPr>
+        <w:spacing w:after="120" w:before="0" w:lineRule="auto"/>
         <w:rPr>
           <w:sz w:val="16"/>
           <w:szCs w:val="16"/>
@@ -179,126 +269,160 @@
       </w:pPr>
       <w:r>
         <w:rPr>
-          <w:rtl w:val="0"/>
-        </w:rPr>
-      </w:r>
-    </w:p>
-    <w:p>
-      <w:pPr>
-        <w:spacing w:before="0" w:after="0" w:line="240" w:lineRule="auto"/>
-        <w:rPr>
-          <w:sz w:val="16"/>
-          <w:szCs w:val="16"/>
-        </w:rPr>
-      </w:pPr>
-      <w:r>
-        <w:rPr>
-          <w:rtl w:val="0"/>
-        </w:rPr>
-      </w:r>
-    </w:p>
-    <w:p>
-      <w:pPr>
-        <w:spacing w:before="400" w:after="80"/>
-      </w:pPr>
-      <w:r>
-        <w:rPr>
-          <w:b/>
-          <w:color w:val="8A5A44"/>
+          <w:b w:val="1"/>
+          <w:bCs w:val="1"/>
+          <w:color w:val="b3261e"/>
+          <w:sz w:val="24"/>
+          <w:szCs w:val="24"/>
+          <w:rtl w:val="0"/>
+        </w:rPr>
+        <w:t xml:space="preserve">A Mughal princess captured in a moment of quiet grace—her delicate expression and flowing details reflecting the softness, elegance, and timeless beauty of a bygone era. Gentle Touch is a celebration of femininity expressed through subtlety and serenity.</w:t>
+      </w:r>
+      <w:r>
+        <w:rPr>
+          <w:rtl w:val="0"/>
+        </w:rPr>
+      </w:r>
+    </w:p>
+    <w:p>
+      <w:pPr>
+        <w:spacing w:after="80" w:before="400" w:lineRule="auto"/>
+        <w:rPr/>
+      </w:pPr>
+      <w:r>
+        <w:rPr>
+          <w:b w:val="1"/>
+          <w:bCs w:val="1"/>
+          <w:color w:val="8a5a44"/>
           <w:sz w:val="30"/>
+          <w:szCs w:val="30"/>
+          <w:rtl w:val="0"/>
         </w:rPr>
         <w:t xml:space="preserve">Discipline</w:t>
       </w:r>
-    </w:p>
-    <w:p>
-      <w:pPr>
-        <w:spacing w:before="0" w:after="160" w:line="276" w:lineRule="auto"/>
+      <w:r>
+        <w:rPr>
+          <w:rtl w:val="0"/>
+        </w:rPr>
+      </w:r>
+    </w:p>
+    <w:p>
+      <w:pPr>
+        <w:spacing w:after="160" w:before="0" w:line="276" w:lineRule="auto"/>
+        <w:rPr/>
       </w:pPr>
       <w:r>
         <w:rPr>
           <w:b w:val="0"/>
-          <w:color w:val="1D1B18"/>
-          <w:sz w:val="24"/>
-        </w:rPr>
-        <w:t xml:space="preserve">Canvas</w:t>
-      </w:r>
-    </w:p>
-    <w:p>
-      <w:pPr>
-        <w:spacing w:before="400" w:after="80"/>
-      </w:pPr>
-      <w:r>
-        <w:rPr>
-          <w:b/>
-          <w:color w:val="8A5A44"/>
+          <w:bCs w:val="0"/>
+          <w:color w:val="1d1b18"/>
+          <w:sz w:val="24"/>
+          <w:szCs w:val="24"/>
+          <w:rtl w:val="0"/>
+        </w:rPr>
+        <w:t xml:space="preserve">C</w:t>
+      </w:r>
+      <w:r>
+        <w:rPr>
+          <w:color w:val="1d1b18"/>
+          <w:sz w:val="24"/>
+          <w:szCs w:val="24"/>
+          <w:rtl w:val="0"/>
+        </w:rPr>
+        <w:t xml:space="preserve">eramic</w:t>
+      </w:r>
+      <w:r>
+        <w:rPr>
+          <w:rtl w:val="0"/>
+        </w:rPr>
+      </w:r>
+    </w:p>
+    <w:p>
+      <w:pPr>
+        <w:spacing w:after="80" w:before="400" w:lineRule="auto"/>
+        <w:rPr/>
+      </w:pPr>
+      <w:r>
+        <w:rPr>
+          <w:b w:val="1"/>
+          <w:bCs w:val="1"/>
+          <w:color w:val="8a5a44"/>
           <w:sz w:val="30"/>
+          <w:szCs w:val="30"/>
+          <w:rtl w:val="0"/>
         </w:rPr>
         <w:t xml:space="preserve">Status</w:t>
       </w:r>
-    </w:p>
-    <w:p>
-      <w:pPr>
-        <w:spacing w:before="0" w:after="120"/>
-      </w:pPr>
-      <w:r>
-        <w:rPr>
-          <w:b/>
-          <w:color w:val="B3261E"/>
-          <w:sz w:val="24"/>
-        </w:rPr>
-        <w:t xml:space="preserve">[todo]</w:t>
-      </w:r>
-    </w:p>
-    <w:p>
-      <w:pPr>
-        <w:spacing w:before="400" w:after="80"/>
-      </w:pPr>
-      <w:r>
-        <w:rPr>
-          <w:b/>
-          <w:color w:val="8A5A44"/>
+      <w:r>
+        <w:rPr>
+          <w:rtl w:val="0"/>
+        </w:rPr>
+      </w:r>
+    </w:p>
+    <w:p>
+      <w:pPr>
+        <w:spacing w:after="120" w:before="0" w:lineRule="auto"/>
+        <w:rPr/>
+      </w:pPr>
+      <w:r>
+        <w:rPr>
+          <w:b w:val="1"/>
+          <w:bCs w:val="1"/>
+          <w:color w:val="b3261e"/>
+          <w:sz w:val="24"/>
+          <w:szCs w:val="24"/>
+          <w:rtl w:val="0"/>
+        </w:rPr>
+        <w:t xml:space="preserve">Sold</w:t>
+      </w:r>
+      <w:r>
+        <w:rPr>
+          <w:rtl w:val="0"/>
+        </w:rPr>
+      </w:r>
+    </w:p>
+    <w:p>
+      <w:pPr>
+        <w:spacing w:after="80" w:before="400" w:lineRule="auto"/>
+        <w:rPr/>
+      </w:pPr>
+      <w:r>
+        <w:rPr>
+          <w:b w:val="1"/>
+          <w:bCs w:val="1"/>
+          <w:color w:val="8a5a44"/>
           <w:sz w:val="30"/>
+          <w:szCs w:val="30"/>
+          <w:rtl w:val="0"/>
         </w:rPr>
         <w:t xml:space="preserve">Year</w:t>
       </w:r>
-    </w:p>
-    <w:p>
-      <w:pPr>
-        <w:spacing w:before="0" w:after="120"/>
-      </w:pPr>
-      <w:r>
-        <w:rPr>
-          <w:b/>
-          <w:color w:val="B3261E"/>
-          <w:sz w:val="24"/>
-        </w:rPr>
-        <w:t xml:space="preserve">[todo]</w:t>
-      </w:r>
-    </w:p>
-    <w:p>
-      <w:pPr>
-        <w:spacing w:before="400" w:after="80"/>
-      </w:pPr>
-      <w:r>
-        <w:rPr>
-          <w:b/>
-          <w:color w:val="8A5A44"/>
-          <w:sz w:val="30"/>
-        </w:rPr>
-        <w:t xml:space="preserve">One liner</w:t>
-      </w:r>
-    </w:p>
-    <w:p>
-      <w:pPr>
-        <w:spacing w:before="0" w:after="120"/>
-      </w:pPr>
-      <w:r>
-        <w:rPr>
-          <w:b/>
-          <w:color w:val="B3261E"/>
-          <w:sz w:val="24"/>
-        </w:rPr>
-        <w:t xml:space="preserve">[todo]</w:t>
+      <w:r>
+        <w:rPr>
+          <w:rtl w:val="0"/>
+        </w:rPr>
+      </w:r>
+    </w:p>
+    <w:p>
+      <w:pPr>
+        <w:spacing w:after="120" w:before="0" w:lineRule="auto"/>
+        <w:rPr/>
+      </w:pPr>
+      <w:r>
+        <w:rPr>
+          <w:b w:val="1"/>
+          <w:bCs w:val="1"/>
+          <w:color w:val="b3261e"/>
+          <w:sz w:val="24"/>
+          <w:szCs w:val="24"/>
+          <w:rtl w:val="0"/>
+        </w:rPr>
+        <w:t xml:space="preserve">2012</w:t>
+      </w:r>
+      <w:r>
+        <w:rPr>
+          <w:rtl w:val="0"/>
+        </w:rPr>
       </w:r>
     </w:p>
     <w:sectPr>
@@ -459,6 +583,20 @@
       <w:sz w:val="52"/>
       <w:szCs w:val="52"/>
     </w:rPr>
+  </w:style>
+  <w:style w:type="table" w:styleId="TableNormal" w:default="1">
+    <w:name w:val="TableNormal"/>
+    <w:tblPr>
+      <w:tblCellMar>
+        <w:top w:w="100.0" w:type="dxa"/>
+        <w:left w:w="100.0" w:type="dxa"/>
+        <w:bottom w:w="100.0" w:type="dxa"/>
+        <w:right w:w="100.0" w:type="dxa"/>
+      </w:tblCellMar>
+    </w:tblPr>
+  </w:style>
+  <w:style w:type="paragraph" w:styleId="Normal" w:default="1">
+    <w:name w:val="normal"/>
   </w:style>
   <w:style w:type="paragraph" w:styleId="Subtitle">
     <w:name w:val="Subtitle"/>
@@ -800,4 +938,19 @@
   </a:objectDefaults>
   <a:extraClrSchemeLst/>
 </a:theme>
+</file>
+
+<file path=customXML/item1.xml><?xml version="1.0" encoding="utf-8"?>
+<go:gDocsCustomXmlDataStorage xmlns:go="http://customooxmlschemas.google.com/" xmlns:r="http://schemas.openxmlformats.org/officeDocument/2006/relationships" uri="GoogleDocsCustomDataVersion2">
+  <go:docsCustomData xmlns:go="http://customooxmlschemas.google.com/" roundtripDataSignature="AMtx7mi4rVYY56ffOdx+gIaR4TmCIeRKvw==">CgMxLjAyDmgub3J4MGh3Z2cyemkxMg5oLnNwMjAyazcwaHo5MTIOaC5lOWg5NDY4bDc2OGoyDmguaHU4NjluaDNwNHZmMg5oLmxzcWFvbnh4OGVrdDgAciExV2lTSFBvRmVfeDdaS3VnaXotaDZSaDdSRlp2SzRuUFI=</go:docsCustomData>
+</go:gDocsCustomXmlDataStorage>
+</file>
+
+<file path=customXML/itemProps1.xml><?xml version="1.0" encoding="utf-8"?>
+<ds:datastoreItem xmlns:ds="http://schemas.openxmlformats.org/officeDocument/2006/customXml" ds:itemID="{11111111-1234-1234-1234-123412341234}">
+  <ds:schemaRefs>
+    <ds:schemaRef ds:uri="http://schemas.openxmlformats.org/officeDocument/2006/relationships"/>
+    <ds:schemaRef ds:uri="http://customooxmlschemas.google.com/"/>
+  </ds:schemaRefs>
+</ds:datastoreItem>
 </file>
</xml_diff>